<commit_message>
feat: update timetable data from new Word document and remove image converter script
</commit_message>
<xml_diff>
--- a/Timetable10.8.docx
+++ b/Timetable10.8.docx
@@ -451,7 +451,9 @@
         </w:tblBorders>
         <w:tblLayout w:type="fixed"/>
         <w:tblCellMar>
+          <w:top w:w="0" w:type="dxa"/>
           <w:left w:w="108" w:type="dxa"/>
+          <w:bottom w:w="0" w:type="dxa"/>
           <w:right w:w="108" w:type="dxa"/>
         </w:tblCellMar>
       </w:tblPr>
@@ -3594,6 +3596,48 @@
               <w:t>IB Geo1</w:t>
             </w:r>
           </w:p>
+          <w:p>
+            <w:pPr>
+              <w:pStyle w:val="4"/>
+              <w:keepNext w:val="0"/>
+              <w:keepLines w:val="0"/>
+              <w:widowControl/>
+              <w:suppressLineNumbers w:val="0"/>
+              <w:spacing w:before="0" w:beforeAutospacing="0" w:after="0" w:afterAutospacing="0"/>
+              <w:ind w:right="0"/>
+              <w:jc w:val="left"/>
+              <w:rPr>
+                <w:rFonts w:hint="default" w:ascii="helvetica" w:hAnsi="helvetica" w:eastAsia="helvetica" w:cs="helvetica"/>
+                <w:kern w:val="0"/>
+                <w:sz w:val="24"/>
+                <w:szCs w:val="24"/>
+                <w:vertAlign w:val="baseline"/>
+                <w:lang w:val="en-US" w:eastAsia="zh-CN" w:bidi="ar"/>
+              </w:rPr>
+            </w:pPr>
+            <w:r>
+              <w:rPr>
+                <w:rFonts w:hint="eastAsia" w:ascii="helvetica" w:hAnsi="helvetica" w:eastAsia="helvetica" w:cs="helvetica"/>
+                <w:kern w:val="0"/>
+                <w:sz w:val="24"/>
+                <w:szCs w:val="24"/>
+                <w:vertAlign w:val="baseline"/>
+                <w:lang w:val="en-US" w:eastAsia="zh-CN" w:bidi="ar"/>
+              </w:rPr>
+              <w:t>IB</w:t>
+            </w:r>
+            <w:r>
+              <w:rPr>
+                <w:rFonts w:hint="default" w:ascii="helvetica" w:hAnsi="helvetica" w:eastAsia="helvetica" w:cs="helvetica"/>
+                <w:kern w:val="0"/>
+                <w:sz w:val="24"/>
+                <w:szCs w:val="24"/>
+                <w:vertAlign w:val="baseline"/>
+                <w:lang w:val="en-US" w:eastAsia="zh-CN" w:bidi="ar"/>
+              </w:rPr>
+              <w:t xml:space="preserve"> Psy 1</w:t>
+            </w:r>
+          </w:p>
         </w:tc>
         <w:tc>
           <w:tcPr>
@@ -3627,7 +3671,20 @@
                 <w:vertAlign w:val="baseline"/>
                 <w:lang w:val="en-US" w:eastAsia="zh-CN" w:bidi="ar"/>
               </w:rPr>
-              <w:t>PD</w:t>
+              <w:t>P</w:t>
+            </w:r>
+            <w:bookmarkStart w:id="0" w:name="_GoBack"/>
+            <w:bookmarkEnd w:id="0"/>
+            <w:r>
+              <w:rPr>
+                <w:rFonts w:hint="default" w:ascii="helvetica" w:hAnsi="helvetica" w:eastAsia="helvetica" w:cs="helvetica"/>
+                <w:kern w:val="0"/>
+                <w:sz w:val="24"/>
+                <w:szCs w:val="24"/>
+                <w:vertAlign w:val="baseline"/>
+                <w:lang w:val="en-US" w:eastAsia="zh-CN" w:bidi="ar"/>
+              </w:rPr>
+              <w:t>D</w:t>
             </w:r>
           </w:p>
         </w:tc>
@@ -4036,8 +4093,6 @@
               </w:rPr>
               <w:t>None</w:t>
             </w:r>
-            <w:bookmarkStart w:id="0" w:name="_GoBack"/>
-            <w:bookmarkEnd w:id="0"/>
           </w:p>
         </w:tc>
       </w:tr>
@@ -4355,6 +4410,9 @@
         </w:tc>
       </w:tr>
       <w:tr>
+        <w:trPr>
+          <w:trHeight w:val="1200" w:hRule="atLeast"/>
+        </w:trPr>
         <w:tc>
           <w:tcPr>
             <w:tcW w:w="1418" w:type="dxa"/>
@@ -4486,6 +4544,48 @@
                 <w:lang w:val="en-US" w:eastAsia="zh-CN" w:bidi="ar"/>
               </w:rPr>
               <w:t>IB Geo1</w:t>
+            </w:r>
+          </w:p>
+          <w:p>
+            <w:pPr>
+              <w:pStyle w:val="4"/>
+              <w:keepNext w:val="0"/>
+              <w:keepLines w:val="0"/>
+              <w:widowControl/>
+              <w:suppressLineNumbers w:val="0"/>
+              <w:spacing w:before="0" w:beforeAutospacing="0" w:after="0" w:afterAutospacing="0"/>
+              <w:ind w:right="0"/>
+              <w:jc w:val="left"/>
+              <w:rPr>
+                <w:rFonts w:hint="default" w:ascii="helvetica" w:hAnsi="helvetica" w:eastAsia="helvetica" w:cs="helvetica"/>
+                <w:kern w:val="0"/>
+                <w:sz w:val="24"/>
+                <w:szCs w:val="24"/>
+                <w:vertAlign w:val="baseline"/>
+                <w:lang w:val="en-US" w:eastAsia="zh-CN" w:bidi="ar"/>
+              </w:rPr>
+            </w:pPr>
+            <w:r>
+              <w:rPr>
+                <w:rFonts w:hint="eastAsia" w:ascii="helvetica" w:hAnsi="helvetica" w:eastAsia="helvetica" w:cs="helvetica"/>
+                <w:kern w:val="0"/>
+                <w:sz w:val="24"/>
+                <w:szCs w:val="24"/>
+                <w:vertAlign w:val="baseline"/>
+                <w:lang w:val="en-US" w:eastAsia="zh-CN" w:bidi="ar"/>
+              </w:rPr>
+              <w:t>IB</w:t>
+            </w:r>
+            <w:r>
+              <w:rPr>
+                <w:rFonts w:hint="default" w:ascii="helvetica" w:hAnsi="helvetica" w:eastAsia="helvetica" w:cs="helvetica"/>
+                <w:kern w:val="0"/>
+                <w:sz w:val="24"/>
+                <w:szCs w:val="24"/>
+                <w:vertAlign w:val="baseline"/>
+                <w:lang w:val="en-US" w:eastAsia="zh-CN" w:bidi="ar"/>
+              </w:rPr>
+              <w:t xml:space="preserve"> Psy 1</w:t>
             </w:r>
           </w:p>
         </w:tc>

</xml_diff>

<commit_message>
fix: update timetable data with precision from docx (exact strings and times)
</commit_message>
<xml_diff>
--- a/Timetable10.8.docx
+++ b/Timetable10.8.docx
@@ -1356,6 +1356,37 @@
               <w:t>IB His2</w:t>
             </w:r>
           </w:p>
+          <w:p>
+            <w:pPr>
+              <w:pStyle w:val="4"/>
+              <w:keepNext w:val="0"/>
+              <w:keepLines w:val="0"/>
+              <w:widowControl/>
+              <w:suppressLineNumbers w:val="0"/>
+              <w:spacing w:before="0" w:beforeAutospacing="0" w:after="0" w:afterAutospacing="0"/>
+              <w:ind w:right="0"/>
+              <w:jc w:val="left"/>
+              <w:rPr>
+                <w:rFonts w:hint="default" w:ascii="helvetica" w:hAnsi="helvetica" w:eastAsia="helvetica" w:cs="helvetica"/>
+                <w:kern w:val="0"/>
+                <w:sz w:val="24"/>
+                <w:szCs w:val="24"/>
+                <w:vertAlign w:val="baseline"/>
+                <w:lang w:val="en-US" w:eastAsia="zh-CN" w:bidi="ar"/>
+              </w:rPr>
+            </w:pPr>
+            <w:r>
+              <w:rPr>
+                <w:rFonts w:hint="default" w:ascii="helvetica" w:hAnsi="helvetica" w:eastAsia="helvetica" w:cs="helvetica"/>
+                <w:kern w:val="0"/>
+                <w:sz w:val="24"/>
+                <w:szCs w:val="24"/>
+                <w:vertAlign w:val="baseline"/>
+                <w:lang w:val="en-US" w:eastAsia="zh-CN" w:bidi="ar"/>
+              </w:rPr>
+              <w:t>IB ESS2</w:t>
+            </w:r>
+          </w:p>
         </w:tc>
       </w:tr>
       <w:tr>
@@ -1646,6 +1677,37 @@
                 <w:lang w:val="en-US" w:eastAsia="zh-CN" w:bidi="ar"/>
               </w:rPr>
               <w:t>IB His2</w:t>
+            </w:r>
+          </w:p>
+          <w:p>
+            <w:pPr>
+              <w:pStyle w:val="4"/>
+              <w:keepNext w:val="0"/>
+              <w:keepLines w:val="0"/>
+              <w:widowControl/>
+              <w:suppressLineNumbers w:val="0"/>
+              <w:spacing w:before="0" w:beforeAutospacing="0" w:after="0" w:afterAutospacing="0"/>
+              <w:ind w:right="0"/>
+              <w:jc w:val="left"/>
+              <w:rPr>
+                <w:rFonts w:hint="default" w:ascii="helvetica" w:hAnsi="helvetica" w:eastAsia="helvetica" w:cs="helvetica"/>
+                <w:kern w:val="0"/>
+                <w:sz w:val="24"/>
+                <w:szCs w:val="24"/>
+                <w:vertAlign w:val="baseline"/>
+                <w:lang w:val="en-US" w:eastAsia="zh-CN" w:bidi="ar"/>
+              </w:rPr>
+            </w:pPr>
+            <w:r>
+              <w:rPr>
+                <w:rFonts w:hint="default" w:ascii="helvetica" w:hAnsi="helvetica" w:eastAsia="helvetica" w:cs="helvetica"/>
+                <w:kern w:val="0"/>
+                <w:sz w:val="24"/>
+                <w:szCs w:val="24"/>
+                <w:vertAlign w:val="baseline"/>
+                <w:lang w:val="en-US" w:eastAsia="zh-CN" w:bidi="ar"/>
+              </w:rPr>
+              <w:t>IB ESS2</w:t>
             </w:r>
           </w:p>
         </w:tc>
@@ -3638,6 +3700,48 @@
               <w:t xml:space="preserve"> Psy 1</w:t>
             </w:r>
           </w:p>
+          <w:p>
+            <w:pPr>
+              <w:pStyle w:val="4"/>
+              <w:keepNext w:val="0"/>
+              <w:keepLines w:val="0"/>
+              <w:widowControl/>
+              <w:suppressLineNumbers w:val="0"/>
+              <w:spacing w:before="0" w:beforeAutospacing="0" w:after="0" w:afterAutospacing="0"/>
+              <w:ind w:right="0"/>
+              <w:jc w:val="left"/>
+              <w:rPr>
+                <w:rFonts w:hint="default" w:ascii="helvetica" w:hAnsi="helvetica" w:eastAsia="helvetica" w:cs="helvetica"/>
+                <w:kern w:val="0"/>
+                <w:sz w:val="24"/>
+                <w:szCs w:val="24"/>
+                <w:vertAlign w:val="baseline"/>
+                <w:lang w:val="en-US" w:eastAsia="zh-CN" w:bidi="ar"/>
+              </w:rPr>
+            </w:pPr>
+            <w:r>
+              <w:rPr>
+                <w:rFonts w:hint="eastAsia" w:ascii="helvetica" w:hAnsi="helvetica" w:eastAsia="helvetica" w:cs="helvetica"/>
+                <w:kern w:val="0"/>
+                <w:sz w:val="24"/>
+                <w:szCs w:val="24"/>
+                <w:vertAlign w:val="baseline"/>
+                <w:lang w:val="en-US" w:eastAsia="zh-CN" w:bidi="ar"/>
+              </w:rPr>
+              <w:t>IB</w:t>
+            </w:r>
+            <w:r>
+              <w:rPr>
+                <w:rFonts w:hint="default" w:ascii="helvetica" w:hAnsi="helvetica" w:eastAsia="helvetica" w:cs="helvetica"/>
+                <w:kern w:val="0"/>
+                <w:sz w:val="24"/>
+                <w:szCs w:val="24"/>
+                <w:vertAlign w:val="baseline"/>
+                <w:lang w:val="en-US" w:eastAsia="zh-CN" w:bidi="ar"/>
+              </w:rPr>
+              <w:t xml:space="preserve"> ESS 1</w:t>
+            </w:r>
+          </w:p>
         </w:tc>
         <w:tc>
           <w:tcPr>
@@ -3671,20 +3775,7 @@
                 <w:vertAlign w:val="baseline"/>
                 <w:lang w:val="en-US" w:eastAsia="zh-CN" w:bidi="ar"/>
               </w:rPr>
-              <w:t>P</w:t>
-            </w:r>
-            <w:bookmarkStart w:id="0" w:name="_GoBack"/>
-            <w:bookmarkEnd w:id="0"/>
-            <w:r>
-              <w:rPr>
-                <w:rFonts w:hint="default" w:ascii="helvetica" w:hAnsi="helvetica" w:eastAsia="helvetica" w:cs="helvetica"/>
-                <w:kern w:val="0"/>
-                <w:sz w:val="24"/>
-                <w:szCs w:val="24"/>
-                <w:vertAlign w:val="baseline"/>
-                <w:lang w:val="en-US" w:eastAsia="zh-CN" w:bidi="ar"/>
-              </w:rPr>
-              <w:t>D</w:t>
+              <w:t>PD</w:t>
             </w:r>
           </w:p>
         </w:tc>
@@ -3824,6 +3915,16 @@
               <w:ind w:right="0"/>
               <w:jc w:val="left"/>
               <w:rPr>
+                <w:rFonts w:hint="default" w:ascii="helvetica" w:hAnsi="helvetica" w:eastAsia="helvetica" w:cs="helvetica"/>
+                <w:kern w:val="0"/>
+                <w:sz w:val="24"/>
+                <w:szCs w:val="24"/>
+                <w:vertAlign w:val="baseline"/>
+                <w:lang w:val="en-US" w:eastAsia="zh-CN" w:bidi="ar"/>
+              </w:rPr>
+            </w:pPr>
+            <w:r>
+              <w:rPr>
                 <w:rFonts w:hint="eastAsia" w:ascii="helvetica" w:hAnsi="helvetica" w:eastAsia="helvetica" w:cs="helvetica"/>
                 <w:kern w:val="0"/>
                 <w:sz w:val="24"/>
@@ -3831,112 +3932,7 @@
                 <w:vertAlign w:val="baseline"/>
                 <w:lang w:val="en-US" w:eastAsia="zh-CN" w:bidi="ar"/>
               </w:rPr>
-            </w:pPr>
-            <w:r>
-              <w:rPr>
-                <w:rFonts w:hint="default" w:ascii="helvetica" w:hAnsi="helvetica" w:eastAsia="helvetica" w:cs="helvetica"/>
-                <w:kern w:val="0"/>
-                <w:sz w:val="24"/>
-                <w:szCs w:val="24"/>
-                <w:vertAlign w:val="baseline"/>
-                <w:lang w:val="en-US" w:eastAsia="zh-CN" w:bidi="ar"/>
-              </w:rPr>
-              <w:t>Nat</w:t>
-            </w:r>
-            <w:r>
-              <w:rPr>
-                <w:rFonts w:hint="eastAsia" w:ascii="helvetica" w:hAnsi="helvetica" w:eastAsia="helvetica" w:cs="helvetica"/>
-                <w:kern w:val="0"/>
-                <w:sz w:val="24"/>
-                <w:szCs w:val="24"/>
-                <w:vertAlign w:val="baseline"/>
-                <w:lang w:val="en-US" w:eastAsia="zh-CN" w:bidi="ar"/>
-              </w:rPr>
-              <w:t>化学</w:t>
-            </w:r>
-          </w:p>
-          <w:p>
-            <w:pPr>
-              <w:pStyle w:val="4"/>
-              <w:keepNext w:val="0"/>
-              <w:keepLines w:val="0"/>
-              <w:widowControl/>
-              <w:suppressLineNumbers w:val="0"/>
-              <w:spacing w:before="0" w:beforeAutospacing="0" w:after="0" w:afterAutospacing="0"/>
-              <w:ind w:right="0"/>
-              <w:jc w:val="left"/>
-              <w:rPr>
-                <w:rFonts w:hint="eastAsia" w:ascii="helvetica" w:hAnsi="helvetica" w:eastAsia="helvetica" w:cs="helvetica"/>
-                <w:kern w:val="0"/>
-                <w:sz w:val="24"/>
-                <w:szCs w:val="24"/>
-                <w:vertAlign w:val="baseline"/>
-                <w:lang w:val="en-US" w:eastAsia="zh-CN" w:bidi="ar"/>
-              </w:rPr>
-            </w:pPr>
-            <w:r>
-              <w:rPr>
-                <w:rFonts w:hint="default" w:ascii="helvetica" w:hAnsi="helvetica" w:eastAsia="helvetica" w:cs="helvetica"/>
-                <w:kern w:val="0"/>
-                <w:sz w:val="24"/>
-                <w:szCs w:val="24"/>
-                <w:vertAlign w:val="baseline"/>
-                <w:lang w:val="en-US" w:eastAsia="zh-CN" w:bidi="ar"/>
-              </w:rPr>
-              <w:t>Nat</w:t>
-            </w:r>
-            <w:r>
-              <w:rPr>
-                <w:rFonts w:hint="eastAsia" w:ascii="helvetica" w:hAnsi="helvetica" w:eastAsia="helvetica" w:cs="helvetica"/>
-                <w:kern w:val="0"/>
-                <w:sz w:val="24"/>
-                <w:szCs w:val="24"/>
-                <w:vertAlign w:val="baseline"/>
-                <w:lang w:val="en-US" w:eastAsia="zh-CN" w:bidi="ar"/>
-              </w:rPr>
-              <w:t>物理</w:t>
-            </w:r>
-          </w:p>
-          <w:p>
-            <w:pPr>
-              <w:pStyle w:val="4"/>
-              <w:keepNext w:val="0"/>
-              <w:keepLines w:val="0"/>
-              <w:widowControl/>
-              <w:suppressLineNumbers w:val="0"/>
-              <w:spacing w:before="0" w:beforeAutospacing="0" w:after="0" w:afterAutospacing="0"/>
-              <w:ind w:right="0"/>
-              <w:jc w:val="left"/>
-              <w:rPr>
-                <w:rFonts w:hint="default" w:ascii="helvetica" w:hAnsi="helvetica" w:eastAsia="helvetica" w:cs="helvetica"/>
-                <w:kern w:val="0"/>
-                <w:sz w:val="24"/>
-                <w:szCs w:val="24"/>
-                <w:vertAlign w:val="baseline"/>
-                <w:lang w:val="en-US" w:eastAsia="zh-CN" w:bidi="ar"/>
-              </w:rPr>
-            </w:pPr>
-            <w:r>
-              <w:rPr>
-                <w:rFonts w:hint="default" w:ascii="helvetica" w:hAnsi="helvetica" w:eastAsia="helvetica" w:cs="helvetica"/>
-                <w:kern w:val="0"/>
-                <w:sz w:val="24"/>
-                <w:szCs w:val="24"/>
-                <w:vertAlign w:val="baseline"/>
-                <w:lang w:val="en-US" w:eastAsia="zh-CN" w:bidi="ar"/>
-              </w:rPr>
-              <w:t>Nat</w:t>
-            </w:r>
-            <w:r>
-              <w:rPr>
-                <w:rFonts w:hint="eastAsia" w:ascii="helvetica" w:hAnsi="helvetica" w:eastAsia="helvetica" w:cs="helvetica"/>
-                <w:kern w:val="0"/>
-                <w:sz w:val="24"/>
-                <w:szCs w:val="24"/>
-                <w:vertAlign w:val="baseline"/>
-                <w:lang w:val="en-US" w:eastAsia="zh-CN" w:bidi="ar"/>
-              </w:rPr>
-              <w:t>生物</w:t>
+              <w:t>国家理科</w:t>
             </w:r>
           </w:p>
         </w:tc>
@@ -4148,6 +4144,16 @@
               <w:ind w:right="0"/>
               <w:jc w:val="left"/>
               <w:rPr>
+                <w:rFonts w:hint="default" w:ascii="helvetica" w:hAnsi="helvetica" w:eastAsia="helvetica" w:cs="helvetica"/>
+                <w:kern w:val="0"/>
+                <w:sz w:val="24"/>
+                <w:szCs w:val="24"/>
+                <w:vertAlign w:val="baseline"/>
+                <w:lang w:val="en-US" w:eastAsia="zh-CN" w:bidi="ar"/>
+              </w:rPr>
+            </w:pPr>
+            <w:r>
+              <w:rPr>
                 <w:rFonts w:hint="eastAsia" w:ascii="helvetica" w:hAnsi="helvetica" w:eastAsia="helvetica" w:cs="helvetica"/>
                 <w:kern w:val="0"/>
                 <w:sz w:val="24"/>
@@ -4155,112 +4161,7 @@
                 <w:vertAlign w:val="baseline"/>
                 <w:lang w:val="en-US" w:eastAsia="zh-CN" w:bidi="ar"/>
               </w:rPr>
-            </w:pPr>
-            <w:r>
-              <w:rPr>
-                <w:rFonts w:hint="default" w:ascii="helvetica" w:hAnsi="helvetica" w:eastAsia="helvetica" w:cs="helvetica"/>
-                <w:kern w:val="0"/>
-                <w:sz w:val="24"/>
-                <w:szCs w:val="24"/>
-                <w:vertAlign w:val="baseline"/>
-                <w:lang w:val="en-US" w:eastAsia="zh-CN" w:bidi="ar"/>
-              </w:rPr>
-              <w:t>Nat</w:t>
-            </w:r>
-            <w:r>
-              <w:rPr>
-                <w:rFonts w:hint="eastAsia" w:ascii="helvetica" w:hAnsi="helvetica" w:eastAsia="helvetica" w:cs="helvetica"/>
-                <w:kern w:val="0"/>
-                <w:sz w:val="24"/>
-                <w:szCs w:val="24"/>
-                <w:vertAlign w:val="baseline"/>
-                <w:lang w:val="en-US" w:eastAsia="zh-CN" w:bidi="ar"/>
-              </w:rPr>
-              <w:t>化学</w:t>
-            </w:r>
-          </w:p>
-          <w:p>
-            <w:pPr>
-              <w:pStyle w:val="4"/>
-              <w:keepNext w:val="0"/>
-              <w:keepLines w:val="0"/>
-              <w:widowControl/>
-              <w:suppressLineNumbers w:val="0"/>
-              <w:spacing w:before="0" w:beforeAutospacing="0" w:after="0" w:afterAutospacing="0"/>
-              <w:ind w:right="0"/>
-              <w:jc w:val="left"/>
-              <w:rPr>
-                <w:rFonts w:hint="eastAsia" w:ascii="helvetica" w:hAnsi="helvetica" w:eastAsia="helvetica" w:cs="helvetica"/>
-                <w:kern w:val="0"/>
-                <w:sz w:val="24"/>
-                <w:szCs w:val="24"/>
-                <w:vertAlign w:val="baseline"/>
-                <w:lang w:val="en-US" w:eastAsia="zh-CN" w:bidi="ar"/>
-              </w:rPr>
-            </w:pPr>
-            <w:r>
-              <w:rPr>
-                <w:rFonts w:hint="default" w:ascii="helvetica" w:hAnsi="helvetica" w:eastAsia="helvetica" w:cs="helvetica"/>
-                <w:kern w:val="0"/>
-                <w:sz w:val="24"/>
-                <w:szCs w:val="24"/>
-                <w:vertAlign w:val="baseline"/>
-                <w:lang w:val="en-US" w:eastAsia="zh-CN" w:bidi="ar"/>
-              </w:rPr>
-              <w:t>Nat</w:t>
-            </w:r>
-            <w:r>
-              <w:rPr>
-                <w:rFonts w:hint="eastAsia" w:ascii="helvetica" w:hAnsi="helvetica" w:eastAsia="helvetica" w:cs="helvetica"/>
-                <w:kern w:val="0"/>
-                <w:sz w:val="24"/>
-                <w:szCs w:val="24"/>
-                <w:vertAlign w:val="baseline"/>
-                <w:lang w:val="en-US" w:eastAsia="zh-CN" w:bidi="ar"/>
-              </w:rPr>
-              <w:t>物理</w:t>
-            </w:r>
-          </w:p>
-          <w:p>
-            <w:pPr>
-              <w:pStyle w:val="4"/>
-              <w:keepNext w:val="0"/>
-              <w:keepLines w:val="0"/>
-              <w:widowControl/>
-              <w:suppressLineNumbers w:val="0"/>
-              <w:spacing w:before="0" w:beforeAutospacing="0" w:after="0" w:afterAutospacing="0"/>
-              <w:ind w:right="0"/>
-              <w:jc w:val="left"/>
-              <w:rPr>
-                <w:rFonts w:hint="default" w:ascii="helvetica" w:hAnsi="helvetica" w:eastAsia="helvetica" w:cs="helvetica"/>
-                <w:kern w:val="0"/>
-                <w:sz w:val="24"/>
-                <w:szCs w:val="24"/>
-                <w:vertAlign w:val="baseline"/>
-                <w:lang w:val="en-US" w:eastAsia="zh-CN" w:bidi="ar"/>
-              </w:rPr>
-            </w:pPr>
-            <w:r>
-              <w:rPr>
-                <w:rFonts w:hint="default" w:ascii="helvetica" w:hAnsi="helvetica" w:eastAsia="helvetica" w:cs="helvetica"/>
-                <w:kern w:val="0"/>
-                <w:sz w:val="24"/>
-                <w:szCs w:val="24"/>
-                <w:vertAlign w:val="baseline"/>
-                <w:lang w:val="en-US" w:eastAsia="zh-CN" w:bidi="ar"/>
-              </w:rPr>
-              <w:t>Nat</w:t>
-            </w:r>
-            <w:r>
-              <w:rPr>
-                <w:rFonts w:hint="eastAsia" w:ascii="helvetica" w:hAnsi="helvetica" w:eastAsia="helvetica" w:cs="helvetica"/>
-                <w:kern w:val="0"/>
-                <w:sz w:val="24"/>
-                <w:szCs w:val="24"/>
-                <w:vertAlign w:val="baseline"/>
-                <w:lang w:val="en-US" w:eastAsia="zh-CN" w:bidi="ar"/>
-              </w:rPr>
-              <w:t>生物</w:t>
+              <w:t>国家理科</w:t>
             </w:r>
           </w:p>
         </w:tc>
@@ -4588,6 +4489,48 @@
               <w:t xml:space="preserve"> Psy 1</w:t>
             </w:r>
           </w:p>
+          <w:p>
+            <w:pPr>
+              <w:pStyle w:val="4"/>
+              <w:keepNext w:val="0"/>
+              <w:keepLines w:val="0"/>
+              <w:widowControl/>
+              <w:suppressLineNumbers w:val="0"/>
+              <w:spacing w:before="0" w:beforeAutospacing="0" w:after="0" w:afterAutospacing="0"/>
+              <w:ind w:right="0"/>
+              <w:jc w:val="left"/>
+              <w:rPr>
+                <w:rFonts w:hint="default" w:ascii="helvetica" w:hAnsi="helvetica" w:eastAsia="helvetica" w:cs="helvetica"/>
+                <w:kern w:val="0"/>
+                <w:sz w:val="24"/>
+                <w:szCs w:val="24"/>
+                <w:vertAlign w:val="baseline"/>
+                <w:lang w:val="en-US" w:eastAsia="zh-CN" w:bidi="ar"/>
+              </w:rPr>
+            </w:pPr>
+            <w:r>
+              <w:rPr>
+                <w:rFonts w:hint="eastAsia" w:ascii="helvetica" w:hAnsi="helvetica" w:eastAsia="helvetica" w:cs="helvetica"/>
+                <w:kern w:val="0"/>
+                <w:sz w:val="24"/>
+                <w:szCs w:val="24"/>
+                <w:vertAlign w:val="baseline"/>
+                <w:lang w:val="en-US" w:eastAsia="zh-CN" w:bidi="ar"/>
+              </w:rPr>
+              <w:t>IB</w:t>
+            </w:r>
+            <w:r>
+              <w:rPr>
+                <w:rFonts w:hint="default" w:ascii="helvetica" w:hAnsi="helvetica" w:eastAsia="helvetica" w:cs="helvetica"/>
+                <w:kern w:val="0"/>
+                <w:sz w:val="24"/>
+                <w:szCs w:val="24"/>
+                <w:vertAlign w:val="baseline"/>
+                <w:lang w:val="en-US" w:eastAsia="zh-CN" w:bidi="ar"/>
+              </w:rPr>
+              <w:t xml:space="preserve"> ESS 1</w:t>
+            </w:r>
+          </w:p>
         </w:tc>
         <w:tc>
           <w:tcPr>
@@ -4621,7 +4564,20 @@
                 <w:vertAlign w:val="baseline"/>
                 <w:lang w:val="en-US" w:eastAsia="zh-CN" w:bidi="ar"/>
               </w:rPr>
-              <w:t>None</w:t>
+              <w:t>Non</w:t>
+            </w:r>
+            <w:bookmarkStart w:id="0" w:name="_GoBack"/>
+            <w:bookmarkEnd w:id="0"/>
+            <w:r>
+              <w:rPr>
+                <w:rFonts w:hint="default" w:ascii="helvetica" w:hAnsi="helvetica" w:eastAsia="helvetica" w:cs="helvetica"/>
+                <w:kern w:val="0"/>
+                <w:sz w:val="24"/>
+                <w:szCs w:val="24"/>
+                <w:vertAlign w:val="baseline"/>
+                <w:lang w:val="en-US" w:eastAsia="zh-CN" w:bidi="ar"/>
+              </w:rPr>
+              <w:t>e</w:t>
             </w:r>
           </w:p>
         </w:tc>

</xml_diff>